<commit_message>
Update python-net docs for 26.10: outputs from the 26.10 wheel, installation and platform requirements, evaluation marks, preview callbacks and the AGENTS.md copy
</commit_message>
<xml_diff>
--- a/python-net/_output_files/developer-guide/advanced-usage/adding-watermarks/add-watermarks-to-word-processing-documents/locking-watermark-in-word-processing-document/add_locked_watermark/output.docx
+++ b/python-net/_output_files/developer-guide/advanced-usage/adding-watermarks/add-watermarks-to-word-processing-documents/locking-watermark-in-word-processing-document/add_locked_watermark/output.docx
@@ -4339,7 +4339,7 @@
       <w:drawing>
         <wp:inline>
           <wp:extent cx="1270000" cy="381000"/>
-          <wp:docPr id="1511455451" name="Header logo"/>
+          <wp:docPr id="590240368" name="Header logo"/>
           <wp:cNvGraphicFramePr>
             <a:graphicFrameLocks xmlns:a="http://schemas.openxmlformats.org/drawingml/2006/main" noChangeAspect="1"/>
           </wp:cNvGraphicFramePr>
@@ -4347,7 +4347,7 @@
             <a:graphicData uri="http://schemas.openxmlformats.org/drawingml/2006/picture">
               <pic:pic xmlns:pic="http://schemas.openxmlformats.org/drawingml/2006/picture">
                 <pic:nvPicPr>
-                  <pic:cNvPr id="1511455451" name=""/>
+                  <pic:cNvPr id="590240368" name=""/>
                   <pic:cNvPicPr>
                     <a:picLocks noChangeAspect="1"/>
                   </pic:cNvPicPr>
@@ -4401,7 +4401,7 @@
       <w:drawing>
         <wp:inline>
           <wp:extent cx="1270000" cy="381000"/>
-          <wp:docPr id="545110552" name="Header logo"/>
+          <wp:docPr id="1440419634" name="Header logo"/>
           <wp:cNvGraphicFramePr>
             <a:graphicFrameLocks xmlns:a="http://schemas.openxmlformats.org/drawingml/2006/main" noChangeAspect="1"/>
           </wp:cNvGraphicFramePr>
@@ -4409,7 +4409,7 @@
             <a:graphicData uri="http://schemas.openxmlformats.org/drawingml/2006/picture">
               <pic:pic xmlns:pic="http://schemas.openxmlformats.org/drawingml/2006/picture">
                 <pic:nvPicPr>
-                  <pic:cNvPr id="545110552" name=""/>
+                  <pic:cNvPr id="1440419634" name=""/>
                   <pic:cNvPicPr>
                     <a:picLocks noChangeAspect="1"/>
                   </pic:cNvPicPr>
@@ -4463,7 +4463,7 @@
       <w:drawing>
         <wp:inline>
           <wp:extent cx="1270000" cy="381000"/>
-          <wp:docPr id="186072047" name="Header logo"/>
+          <wp:docPr id="274776993" name="Header logo"/>
           <wp:cNvGraphicFramePr>
             <a:graphicFrameLocks xmlns:a="http://schemas.openxmlformats.org/drawingml/2006/main" noChangeAspect="1"/>
           </wp:cNvGraphicFramePr>
@@ -4471,7 +4471,7 @@
             <a:graphicData uri="http://schemas.openxmlformats.org/drawingml/2006/picture">
               <pic:pic xmlns:pic="http://schemas.openxmlformats.org/drawingml/2006/picture">
                 <pic:nvPicPr>
-                  <pic:cNvPr id="186072047" name=""/>
+                  <pic:cNvPr id="274776993" name=""/>
                   <pic:cNvPicPr>
                     <a:picLocks noChangeAspect="1"/>
                   </pic:cNvPicPr>
@@ -4525,7 +4525,7 @@
       <w:drawing>
         <wp:inline>
           <wp:extent cx="1270000" cy="381000"/>
-          <wp:docPr id="315319359" name="Header logo"/>
+          <wp:docPr id="810266904" name="Header logo"/>
           <wp:cNvGraphicFramePr>
             <a:graphicFrameLocks xmlns:a="http://schemas.openxmlformats.org/drawingml/2006/main" noChangeAspect="1"/>
           </wp:cNvGraphicFramePr>
@@ -4533,7 +4533,7 @@
             <a:graphicData uri="http://schemas.openxmlformats.org/drawingml/2006/picture">
               <pic:pic xmlns:pic="http://schemas.openxmlformats.org/drawingml/2006/picture">
                 <pic:nvPicPr>
-                  <pic:cNvPr id="315319359" name=""/>
+                  <pic:cNvPr id="810266904" name=""/>
                   <pic:cNvPicPr>
                     <a:picLocks noChangeAspect="1"/>
                   </pic:cNvPicPr>
@@ -4587,7 +4587,7 @@
       <w:drawing>
         <wp:inline>
           <wp:extent cx="1270000" cy="381000"/>
-          <wp:docPr id="394994419" name="Header logo"/>
+          <wp:docPr id="1985497252" name="Header logo"/>
           <wp:cNvGraphicFramePr>
             <a:graphicFrameLocks xmlns:a="http://schemas.openxmlformats.org/drawingml/2006/main" noChangeAspect="1"/>
           </wp:cNvGraphicFramePr>
@@ -4595,7 +4595,7 @@
             <a:graphicData uri="http://schemas.openxmlformats.org/drawingml/2006/picture">
               <pic:pic xmlns:pic="http://schemas.openxmlformats.org/drawingml/2006/picture">
                 <pic:nvPicPr>
-                  <pic:cNvPr id="394994419" name=""/>
+                  <pic:cNvPr id="1985497252" name=""/>
                   <pic:cNvPicPr>
                     <a:picLocks noChangeAspect="1"/>
                   </pic:cNvPicPr>
@@ -4649,7 +4649,7 @@
       <w:drawing>
         <wp:inline>
           <wp:extent cx="1270000" cy="381000"/>
-          <wp:docPr id="1800937279" name="Header logo"/>
+          <wp:docPr id="874838486" name="Header logo"/>
           <wp:cNvGraphicFramePr>
             <a:graphicFrameLocks xmlns:a="http://schemas.openxmlformats.org/drawingml/2006/main" noChangeAspect="1"/>
           </wp:cNvGraphicFramePr>
@@ -4657,7 +4657,7 @@
             <a:graphicData uri="http://schemas.openxmlformats.org/drawingml/2006/picture">
               <pic:pic xmlns:pic="http://schemas.openxmlformats.org/drawingml/2006/picture">
                 <pic:nvPicPr>
-                  <pic:cNvPr id="1800937279" name=""/>
+                  <pic:cNvPr id="874838486" name=""/>
                   <pic:cNvPicPr>
                     <a:picLocks noChangeAspect="1"/>
                   </pic:cNvPicPr>

</xml_diff>